<commit_message>
EK-2 exporter: surface budget gerekçe detail in filled template
The EK-2 deliverable is built from hardcoded cell strings (not the budget md),
so update those: L4 token-basis estimate, NAS-vs-consumables separation,
TTO/redaksiyon split, and guaranteed-vs-TRUBA-conditional compute scope.

Co-Authored-By: Claude Opus 4.8 <noreply@anthropic.com>
</commit_message>
<xml_diff>
--- a/docs/OpenNutri_1005_EK2_Butce_ve_Gerekcesi.docx
+++ b/docs/OpenNutri_1005_EK2_Butce_ve_Gerekcesi.docx
@@ -2482,7 +2482,7 @@
                 <w:rFonts w:ascii="Arial" w:hAnsi="Arial" w:eastAsia="Arial"/>
                 <w:sz w:val="12"/>
               </w:rPr>
-              <w:t>L3 ağırlıkları açık modellerin geliştirme/testi, çıkarım servisleri, Öğrenilmiş Yönlendirici eğitimi ve PEFT/LoRA-QLoRA ölçeğinde yerel ince ayar.</w:t>
+              <w:t>L3 ağırlıkları açık modellerin geliştirme/testi, çıkarım servisleri, Öğrenilmiş Yönlendirici eğitimi ve PEFT/LoRA-QLoRA ölçeğinde yerel ince ayar. Garanti edilen 1-13B model deneylerini ve LoRA/QLoRA ince ayarını karşılar; 30-70B ve tam ince ayar TRUBA'ya bağlı koşullu deneylerdir.</w:t>
             </w:r>
           </w:p>
         </w:tc>
@@ -3146,7 +3146,7 @@
                 <w:rFonts w:ascii="Arial" w:hAnsi="Arial" w:eastAsia="Arial"/>
                 <w:sz w:val="13"/>
               </w:rPr>
-              <w:t>Depolama genişletme, yedek parça ve laboratuvar/altyapı sarf ihtiyaçları.</w:t>
+              <w:t>Depolama genişletme, yedek parça ve altyapı sarf ihtiyaçları; Makine-Teçhizat kalemindeki NAS depolamadan ayrı, tüketilebilir/yedek bileşenlerdir.</w:t>
             </w:r>
           </w:p>
         </w:tc>
@@ -3834,7 +3834,7 @@
                 <w:rFonts w:ascii="Arial" w:hAnsi="Arial" w:eastAsia="Arial"/>
                 <w:sz w:val="12"/>
               </w:rPr>
-              <w:t>L4 yükseltme katmanı, maliyet-kalite kıyaslaması ve yalnızca başarısız alt görevlerde sınırlı ticari API çağrıları.</w:t>
+              <w:t>L4 yükseltme katmanı ve maliyet-kalite kıyaslaması; yalnızca başarısız alt görevlerde sınırlı ticari API çağrıları. Tahmini temel: makalelerin ~%10-15'inde, çağrı başına ~3-5K token ve güncel ticari model fiyatları, artı kilitli kıyaslama test kümesinin token bütçesi.</w:t>
             </w:r>
           </w:p>
         </w:tc>
@@ -4059,7 +4059,7 @@
                 <w:rFonts w:ascii="Arial" w:hAnsi="Arial" w:eastAsia="Arial"/>
                 <w:sz w:val="12"/>
               </w:rPr>
-              <w:t>Patent ön taramasının ürünleşme aşamasında güncellenmesi ve yayın redaksiyonu.</w:t>
+              <w:t>Patent ön taramasının ürünleşme aşamasında güncellenmesi (~7.000 TL) ve hakemli yayınlar için redaksiyon/çeviri (~8.000 TL).</w:t>
             </w:r>
           </w:p>
         </w:tc>

</xml_diff>